<commit_message>
Update deck with Samuel Utibe real bio - 6+ years Web3
Co-authored-by: Capy <capy@capy.ai>
</commit_message>
<xml_diff>
--- a/DecaFlow_Pitch_Deck_v2.docx
+++ b/DecaFlow_Pitch_Deck_v2.docx
@@ -2795,7 +2795,7 @@
                 <w:sz w:val="22"/>
                 <w:szCs w:val="22"/>
               </w:rPr>
-              <w:t xml:space="preserve">• Web3 builder with deep DeFi and blockchain expertise</w:t>
+              <w:t xml:space="preserve">• 6+ years building Web3 &amp; blockchain solutions</w:t>
             </w:r>
           </w:p>
           <w:p>
@@ -2808,7 +2808,7 @@
                 <w:sz w:val="22"/>
                 <w:szCs w:val="22"/>
               </w:rPr>
-              <w:t xml:space="preserve">• Previously led BD and partnerships in crypto ecosystem</w:t>
+              <w:t xml:space="preserve">• Co-Founded and scaled multiple technology ventures from 0→1</w:t>
             </w:r>
           </w:p>
           <w:p>
@@ -2821,7 +2821,7 @@
                 <w:sz w:val="22"/>
                 <w:szCs w:val="22"/>
               </w:rPr>
-              <w:t xml:space="preserve">• Track record of shipping products from 0 to 1</w:t>
+              <w:t xml:space="preserve">• Deep expertise in smart contracts, DeFi, NFT, and DAO architectures</w:t>
             </w:r>
           </w:p>
           <w:p>
@@ -2834,7 +2834,7 @@
                 <w:sz w:val="22"/>
                 <w:szCs w:val="22"/>
               </w:rPr>
-              <w:t xml:space="preserve">• Technical background in smart contracts and DeFi protocols</w:t>
+              <w:t xml:space="preserve">• Led distributed cross-functional teams using Agile/Scrum</w:t>
             </w:r>
           </w:p>
         </w:tc>

</xml_diff>